<commit_message>
Rebuild Word documents to reflect dosissen.html modal change
Regenerated from updated source .txt files after replacing the
dosisoverzicht PNG modal with the dosissen.html iframe.

https://claude.ai/code/session_015B3yXKTR8ayRzVbvAmrArn
</commit_message>
<xml_diff>
--- a/Isotope_Dashboard_Managers_Handleiding.docx
+++ b/Isotope_Dashboard_Managers_Handleiding.docx
@@ -2352,7 +2352,7 @@
           <w:sz w:val="18"/>
           <w:u w:val="none"/>
         </w:rPr>
-        <w:t xml:space="preserve">        Toont het dosisoverzichtsbeeld — de stralingsdosis per medewerker over</w:t>
+        <w:t xml:space="preserve">        Toont het dosisoverzicht — de stralingsdosis per medewerker over de</w:t>
       </w:r>
     </w:p>
     <w:p>
@@ -2369,7 +2369,41 @@
           <w:sz w:val="18"/>
           <w:u w:val="none"/>
         </w:rPr>
-        <w:t xml:space="preserve">        de afgelopen 30 dagen en de afgelopen 365 dagen.</w:t>
+        <w:t xml:space="preserve">        afgelopen 30 dagen en de afgelopen 365 dagen.  De inhoud wordt geladen</w:t>
+      </w:r>
+    </w:p>
+    <w:p>
+      <w:pPr>
+        <w:spacing w:before="0" w:after="0" w:line="240" w:lineRule="exact"/>
+        <w:shd w:val="clear" w:color="auto" w:fill="F2F2F2"/>
+      </w:pPr>
+      <w:r>
+        <w:rPr>
+          <w:rFonts w:ascii="Courier New" w:hAnsi="Courier New"/>
+          <w:b w:val="0"/>
+          <w:i w:val="0"/>
+          <w:color w:val="333333"/>
+          <w:sz w:val="18"/>
+          <w:u w:val="none"/>
+        </w:rPr>
+        <w:t xml:space="preserve">        vanuit X:\Cyclotron\Dashboard Cyclotron\dosissen.html en weergegeven</w:t>
+      </w:r>
+    </w:p>
+    <w:p>
+      <w:pPr>
+        <w:spacing w:before="0" w:after="0" w:line="240" w:lineRule="exact"/>
+        <w:shd w:val="clear" w:color="auto" w:fill="F2F2F2"/>
+      </w:pPr>
+      <w:r>
+        <w:rPr>
+          <w:rFonts w:ascii="Courier New" w:hAnsi="Courier New"/>
+          <w:b w:val="0"/>
+          <w:i w:val="0"/>
+          <w:color w:val="333333"/>
+          <w:sz w:val="18"/>
+          <w:u w:val="none"/>
+        </w:rPr>
+        <w:t xml:space="preserve">        als schermvullende ingesloten pagina.</w:t>
       </w:r>
     </w:p>
     <w:p>

</xml_diff>

<commit_message>
Document script health status bar in all manuals; rebuild Word docs
MANUAL.txt:
- Pipeline I/O diagram: add heartbeat.db row
- §4.3: update to mention dosissen HTML, add §4.4 for heartbeat reader
- §11.2: add status bar to sections list
- §11.9: new section documenting status bar, colours, tooltip, and
  fail-silent behaviour
- Config paths table: add paths.heartbeat_db entry

MANUAL_MANAGER.txt / MANUAL_MANAGER_NL.txt:
- Insert §1.2 Script health status bar (🟢🟡🔴 colour logic, contact)
- Renumber old §1.2 navigation buttons → §1.3
- Renumber §1.3 two versions → §1.4
- Update TOC and quick-reference table

Isotope_Dashboard_Manual.docx / Isotope_Dashboard_Managers_Handleiding.docx:
- Rebuilt from updated source files

https://claude.ai/code/session_015B3yXKTR8ayRzVbvAmrArn
</commit_message>
<xml_diff>
--- a/Isotope_Dashboard_Managers_Handleiding.docx
+++ b/Isotope_Dashboard_Managers_Handleiding.docx
@@ -427,7 +427,7 @@
           <w:sz w:val="18"/>
           <w:u w:val="none"/>
         </w:rPr>
-        <w:t>1.2  De navigatieknoppen</w:t>
+        <w:t>1.2  Scriptstatus-statusbalk</w:t>
       </w:r>
     </w:p>
     <w:p>
@@ -444,7 +444,24 @@
           <w:sz w:val="18"/>
           <w:u w:val="none"/>
         </w:rPr>
-        <w:t>1.3  Twee versies van het dashboard</w:t>
+        <w:t>1.3  De navigatieknoppen</w:t>
+      </w:r>
+    </w:p>
+    <w:p>
+      <w:pPr>
+        <w:spacing w:before="0" w:after="0"/>
+        <w:ind w:left="360"/>
+      </w:pPr>
+      <w:r>
+        <w:rPr>
+          <w:rFonts w:ascii="Calibri" w:hAnsi="Calibri"/>
+          <w:b w:val="0"/>
+          <w:i w:val="0"/>
+          <w:color w:val="000000"/>
+          <w:sz w:val="18"/>
+          <w:u w:val="none"/>
+        </w:rPr>
+        <w:t>1.4  Twee versies van het dashboard</w:t>
       </w:r>
     </w:p>
     <w:p>
@@ -1578,7 +1595,7 @@
           <w:sz w:val="20"/>
           <w:u w:val="none"/>
         </w:rPr>
-        <w:t xml:space="preserve">  1. Wat het dashboard laat zien (incl. navigatieknoppen §1.2)</w:t>
+        <w:t xml:space="preserve">  1. Wat het dashboard laat zien (incl. navigatieknoppen §1.3)</w:t>
       </w:r>
     </w:p>
     <w:p>
@@ -2281,7 +2298,7 @@
           <w:sz w:val="26"/>
           <w:u w:val="none"/>
         </w:rPr>
-        <w:t>1.2  De navigatieknoppen</w:t>
+        <w:t>1.2  Scriptstatus-statusbalk</w:t>
       </w:r>
     </w:p>
     <w:p>
@@ -2297,7 +2314,7 @@
           <w:sz w:val="20"/>
           <w:u w:val="none"/>
         </w:rPr>
-        <w:t>Bovenaan het volledige dashboard staan vier grote knoppen.  Elke knop opent een</w:t>
+        <w:t>Direct boven de navigatieknoppen staat een rij kleine statusindicatoren —</w:t>
       </w:r>
     </w:p>
     <w:p>
@@ -2313,7 +2330,23 @@
           <w:sz w:val="20"/>
           <w:u w:val="none"/>
         </w:rPr>
-        <w:t>schermvullend pop-upvenster.  Sluit een venster met het × rechtsboven.</w:t>
+        <w:t>één per achtergrondscript.  Elke indicator toont een gekleurde stip en de</w:t>
+      </w:r>
+    </w:p>
+    <w:p>
+      <w:pPr>
+        <w:spacing w:before="0" w:after="80"/>
+      </w:pPr>
+      <w:r>
+        <w:rPr>
+          <w:rFonts w:ascii="Calibri" w:hAnsi="Calibri"/>
+          <w:b w:val="0"/>
+          <w:i w:val="0"/>
+          <w:color w:val="000000"/>
+          <w:sz w:val="20"/>
+          <w:u w:val="none"/>
+        </w:rPr>
+        <w:t>naam van het script.</w:t>
       </w:r>
     </w:p>
     <w:p>
@@ -2335,7 +2368,7 @@
           <w:sz w:val="18"/>
           <w:u w:val="none"/>
         </w:rPr>
-        <w:t xml:space="preserve">    Dosisoverzicht</w:t>
+        <w:t xml:space="preserve">    🟢  Groen  — script heeft binnen de afgelopen 15 minuten gemeld en is OK</w:t>
       </w:r>
     </w:p>
     <w:p>
@@ -2352,7 +2385,7 @@
           <w:sz w:val="18"/>
           <w:u w:val="none"/>
         </w:rPr>
-        <w:t xml:space="preserve">        Toont het dosisoverzicht — de stralingsdosis per medewerker over de</w:t>
+        <w:t xml:space="preserve">    🟡  Geel   — script heeft gemeld maar heeft waarschuwingen of herhaalde fouten</w:t>
       </w:r>
     </w:p>
     <w:p>
@@ -2369,8 +2402,156 @@
           <w:sz w:val="18"/>
           <w:u w:val="none"/>
         </w:rPr>
-        <w:t xml:space="preserve">        afgelopen 30 dagen en de afgelopen 365 dagen.  De inhoud wordt geladen</w:t>
-      </w:r>
+        <w:t xml:space="preserve">    🔴  Rood   — er is meer dan 15 minuten geen heartbeat ontvangen</w:t>
+      </w:r>
+    </w:p>
+    <w:p>
+      <w:pPr>
+        <w:spacing w:before="0" w:after="80"/>
+      </w:pPr>
+    </w:p>
+    <w:p>
+      <w:pPr>
+        <w:spacing w:before="0" w:after="80"/>
+      </w:pPr>
+      <w:r>
+        <w:rPr>
+          <w:rFonts w:ascii="Calibri" w:hAnsi="Calibri"/>
+          <w:b w:val="0"/>
+          <w:i w:val="0"/>
+          <w:color w:val="000000"/>
+          <w:sz w:val="20"/>
+          <w:u w:val="none"/>
+        </w:rPr>
+        <w:t>Bewegen met de muis over een indicator toont het exacte tijdstip van de</w:t>
+      </w:r>
+    </w:p>
+    <w:p>
+      <w:pPr>
+        <w:spacing w:before="0" w:after="80"/>
+      </w:pPr>
+      <w:r>
+        <w:rPr>
+          <w:rFonts w:ascii="Calibri" w:hAnsi="Calibri"/>
+          <w:b w:val="0"/>
+          <w:i w:val="0"/>
+          <w:color w:val="000000"/>
+          <w:sz w:val="20"/>
+          <w:u w:val="none"/>
+        </w:rPr>
+        <w:t>laatste melding, de status en eventuele foutmeldingen.  Als alle indicatoren</w:t>
+      </w:r>
+    </w:p>
+    <w:p>
+      <w:pPr>
+        <w:spacing w:before="0" w:after="80"/>
+      </w:pPr>
+      <w:r>
+        <w:rPr>
+          <w:rFonts w:ascii="Calibri" w:hAnsi="Calibri"/>
+          <w:b w:val="0"/>
+          <w:i w:val="0"/>
+          <w:color w:val="000000"/>
+          <w:sz w:val="20"/>
+          <w:u w:val="none"/>
+        </w:rPr>
+        <w:t>groen zijn, werkt de pipeline normaal.  Een rode of gele indicator dient</w:t>
+      </w:r>
+    </w:p>
+    <w:p>
+      <w:pPr>
+        <w:spacing w:before="0" w:after="80"/>
+      </w:pPr>
+      <w:r>
+        <w:rPr>
+          <w:rFonts w:ascii="Calibri" w:hAnsi="Calibri"/>
+          <w:b w:val="0"/>
+          <w:i w:val="0"/>
+          <w:color w:val="000000"/>
+          <w:sz w:val="20"/>
+          <w:u w:val="none"/>
+        </w:rPr>
+        <w:t>gemeld te worden bij R.A.F. Sierkstra (SIE, tel. 7062).</w:t>
+      </w:r>
+    </w:p>
+    <w:p>
+      <w:pPr>
+        <w:spacing w:before="0" w:after="80"/>
+      </w:pPr>
+    </w:p>
+    <w:p>
+      <w:pPr>
+        <w:spacing w:before="0" w:after="80"/>
+      </w:pPr>
+      <w:r>
+        <w:rPr>
+          <w:rFonts w:ascii="Calibri" w:hAnsi="Calibri"/>
+          <w:b w:val="0"/>
+          <w:i w:val="0"/>
+          <w:color w:val="000000"/>
+          <w:sz w:val="20"/>
+          <w:u w:val="none"/>
+        </w:rPr>
+        <w:t>De balk is afwezig als de heartbeat-database niet bereikbaar is.</w:t>
+      </w:r>
+    </w:p>
+    <w:p>
+      <w:pPr>
+        <w:spacing w:before="0" w:after="80"/>
+      </w:pPr>
+    </w:p>
+    <w:p>
+      <w:pPr>
+        <w:spacing w:before="240" w:after="60"/>
+      </w:pPr>
+      <w:r>
+        <w:rPr>
+          <w:rFonts w:ascii="Calibri" w:hAnsi="Calibri"/>
+          <w:b/>
+          <w:i w:val="0"/>
+          <w:color w:val="4B1E52"/>
+          <w:sz w:val="26"/>
+          <w:u w:val="none"/>
+        </w:rPr>
+        <w:t>1.3  De navigatieknoppen</w:t>
+      </w:r>
+    </w:p>
+    <w:p>
+      <w:pPr>
+        <w:spacing w:before="0" w:after="80"/>
+      </w:pPr>
+      <w:r>
+        <w:rPr>
+          <w:rFonts w:ascii="Calibri" w:hAnsi="Calibri"/>
+          <w:b w:val="0"/>
+          <w:i w:val="0"/>
+          <w:color w:val="000000"/>
+          <w:sz w:val="20"/>
+          <w:u w:val="none"/>
+        </w:rPr>
+        <w:t>Bovenaan het volledige dashboard staan vier grote knoppen.  Elke knop opent een</w:t>
+      </w:r>
+    </w:p>
+    <w:p>
+      <w:pPr>
+        <w:spacing w:before="0" w:after="80"/>
+      </w:pPr>
+      <w:r>
+        <w:rPr>
+          <w:rFonts w:ascii="Calibri" w:hAnsi="Calibri"/>
+          <w:b w:val="0"/>
+          <w:i w:val="0"/>
+          <w:color w:val="000000"/>
+          <w:sz w:val="20"/>
+          <w:u w:val="none"/>
+        </w:rPr>
+        <w:t>schermvullend pop-upvenster.  Sluit een venster met het × rechtsboven.</w:t>
+      </w:r>
+    </w:p>
+    <w:p>
+      <w:pPr>
+        <w:spacing w:before="0" w:after="80"/>
+      </w:pPr>
     </w:p>
     <w:p>
       <w:pPr>
@@ -2386,7 +2567,7 @@
           <w:sz w:val="18"/>
           <w:u w:val="none"/>
         </w:rPr>
-        <w:t xml:space="preserve">        vanuit X:\Cyclotron\Dashboard Cyclotron\dosissen.html en weergegeven</w:t>
+        <w:t xml:space="preserve">    Dosisoverzicht</w:t>
       </w:r>
     </w:p>
     <w:p>
@@ -2403,13 +2584,8 @@
           <w:sz w:val="18"/>
           <w:u w:val="none"/>
         </w:rPr>
-        <w:t xml:space="preserve">        als schermvullende ingesloten pagina.</w:t>
-      </w:r>
-    </w:p>
-    <w:p>
-      <w:pPr>
-        <w:spacing w:before="0" w:after="80"/>
-      </w:pPr>
+        <w:t xml:space="preserve">        Toont het dosisoverzicht — de stralingsdosis per medewerker over de</w:t>
+      </w:r>
     </w:p>
     <w:p>
       <w:pPr>
@@ -2425,7 +2601,7 @@
           <w:sz w:val="18"/>
           <w:u w:val="none"/>
         </w:rPr>
-        <w:t xml:space="preserve">    DM VSM</w:t>
+        <w:t xml:space="preserve">        afgelopen 30 dagen en de afgelopen 365 dagen.  De inhoud wordt geladen</w:t>
       </w:r>
     </w:p>
     <w:p>
@@ -2442,7 +2618,7 @@
           <w:sz w:val="18"/>
           <w:u w:val="none"/>
         </w:rPr>
-        <w:t xml:space="preserve">        Toont de Daily Management VSM-tabel: de dagelijkse targetstroomwaarden</w:t>
+        <w:t xml:space="preserve">        vanuit X:\Cyclotron\Dashboard Cyclotron\dosissen.html en weergegeven</w:t>
       </w:r>
     </w:p>
     <w:p>
@@ -2459,8 +2635,13 @@
           <w:sz w:val="18"/>
           <w:u w:val="none"/>
         </w:rPr>
-        <w:t xml:space="preserve">        en het wekelijkse OTIF-percentage per isotoopgroep.  Dit zijn dezelfde</w:t>
-      </w:r>
+        <w:t xml:space="preserve">        als schermvullende ingesloten pagina.</w:t>
+      </w:r>
+    </w:p>
+    <w:p>
+      <w:pPr>
+        <w:spacing w:before="0" w:after="80"/>
+      </w:pPr>
     </w:p>
     <w:p>
       <w:pPr>
@@ -2476,13 +2657,8 @@
           <w:sz w:val="18"/>
           <w:u w:val="none"/>
         </w:rPr>
-        <w:t xml:space="preserve">        gegevens als die de OTIF-gedraaide-producties-KPI-tabel voeden.</w:t>
-      </w:r>
-    </w:p>
-    <w:p>
-      <w:pPr>
-        <w:spacing w:before="0" w:after="80"/>
-      </w:pPr>
+        <w:t xml:space="preserve">    DM VSM</w:t>
+      </w:r>
     </w:p>
     <w:p>
       <w:pPr>
@@ -2498,7 +2674,7 @@
           <w:sz w:val="18"/>
           <w:u w:val="none"/>
         </w:rPr>
-        <w:t xml:space="preserve">    Rooster en targetvoorraad</w:t>
+        <w:t xml:space="preserve">        Toont de Daily Management VSM-tabel: de dagelijkse targetstroomwaarden</w:t>
       </w:r>
     </w:p>
     <w:p>
@@ -2515,7 +2691,7 @@
           <w:sz w:val="18"/>
           <w:u w:val="none"/>
         </w:rPr>
-        <w:t xml:space="preserve">        Toont de plannings-HTML: het ploegenschema, geplande</w:t>
+        <w:t xml:space="preserve">        en het wekelijkse OTIF-percentage per isotoopgroep.  Dit zijn dezelfde</w:t>
       </w:r>
     </w:p>
     <w:p>
@@ -2532,7 +2708,7 @@
           <w:sz w:val="18"/>
           <w:u w:val="none"/>
         </w:rPr>
-        <w:t xml:space="preserve">        onderhoudswerkzaamheden en het actuele overzicht van de targetvoorraad.</w:t>
+        <w:t xml:space="preserve">        gegevens als die de OTIF-gedraaide-producties-KPI-tabel voeden.</w:t>
       </w:r>
     </w:p>
     <w:p>
@@ -2554,7 +2730,7 @@
           <w:sz w:val="18"/>
           <w:u w:val="none"/>
         </w:rPr>
-        <w:t xml:space="preserve">    Productieschema</w:t>
+        <w:t xml:space="preserve">    Rooster en targetvoorraad</w:t>
       </w:r>
     </w:p>
     <w:p>
@@ -2571,7 +2747,7 @@
           <w:sz w:val="18"/>
           <w:u w:val="none"/>
         </w:rPr>
-        <w:t xml:space="preserve">        Toont de productieschema-HTML: het gedetailleerde productieschema voor</w:t>
+        <w:t xml:space="preserve">        Toont de plannings-HTML: het ploegenschema, geplande</w:t>
       </w:r>
     </w:p>
     <w:p>
@@ -2588,6 +2764,62 @@
           <w:sz w:val="18"/>
           <w:u w:val="none"/>
         </w:rPr>
+        <w:t xml:space="preserve">        onderhoudswerkzaamheden en het actuele overzicht van de targetvoorraad.</w:t>
+      </w:r>
+    </w:p>
+    <w:p>
+      <w:pPr>
+        <w:spacing w:before="0" w:after="80"/>
+      </w:pPr>
+    </w:p>
+    <w:p>
+      <w:pPr>
+        <w:spacing w:before="0" w:after="0" w:line="240" w:lineRule="exact"/>
+        <w:shd w:val="clear" w:color="auto" w:fill="F2F2F2"/>
+      </w:pPr>
+      <w:r>
+        <w:rPr>
+          <w:rFonts w:ascii="Courier New" w:hAnsi="Courier New"/>
+          <w:b w:val="0"/>
+          <w:i w:val="0"/>
+          <w:color w:val="333333"/>
+          <w:sz w:val="18"/>
+          <w:u w:val="none"/>
+        </w:rPr>
+        <w:t xml:space="preserve">    Productieschema</w:t>
+      </w:r>
+    </w:p>
+    <w:p>
+      <w:pPr>
+        <w:spacing w:before="0" w:after="0" w:line="240" w:lineRule="exact"/>
+        <w:shd w:val="clear" w:color="auto" w:fill="F2F2F2"/>
+      </w:pPr>
+      <w:r>
+        <w:rPr>
+          <w:rFonts w:ascii="Courier New" w:hAnsi="Courier New"/>
+          <w:b w:val="0"/>
+          <w:i w:val="0"/>
+          <w:color w:val="333333"/>
+          <w:sz w:val="18"/>
+          <w:u w:val="none"/>
+        </w:rPr>
+        <w:t xml:space="preserve">        Toont de productieschema-HTML: het gedetailleerde productieschema voor</w:t>
+      </w:r>
+    </w:p>
+    <w:p>
+      <w:pPr>
+        <w:spacing w:before="0" w:after="0" w:line="240" w:lineRule="exact"/>
+        <w:shd w:val="clear" w:color="auto" w:fill="F2F2F2"/>
+      </w:pPr>
+      <w:r>
+        <w:rPr>
+          <w:rFonts w:ascii="Courier New" w:hAnsi="Courier New"/>
+          <w:b w:val="0"/>
+          <w:i w:val="0"/>
+          <w:color w:val="333333"/>
+          <w:sz w:val="18"/>
+          <w:u w:val="none"/>
+        </w:rPr>
         <w:t xml:space="preserve">        de huidige en komende periodes.</w:t>
       </w:r>
     </w:p>
@@ -2609,7 +2841,7 @@
           <w:sz w:val="26"/>
           <w:u w:val="none"/>
         </w:rPr>
-        <w:t>1.3  Twee versies van het dashboard</w:t>
+        <w:t>1.4  Twee versies van het dashboard</w:t>
       </w:r>
     </w:p>
     <w:p>
@@ -11196,7 +11428,24 @@
           <w:sz w:val="18"/>
           <w:u w:val="none"/>
         </w:rPr>
-        <w:t xml:space="preserve">    Navigatieknoppen (Dosisoverzicht, DM VSM, enz.)  Sectie 1.2</w:t>
+        <w:t xml:space="preserve">    Scriptstatus-statusbalk                          Sectie 1.2</w:t>
+      </w:r>
+    </w:p>
+    <w:p>
+      <w:pPr>
+        <w:spacing w:before="0" w:after="0" w:line="240" w:lineRule="exact"/>
+        <w:shd w:val="clear" w:color="auto" w:fill="F2F2F2"/>
+      </w:pPr>
+      <w:r>
+        <w:rPr>
+          <w:rFonts w:ascii="Courier New" w:hAnsi="Courier New"/>
+          <w:b w:val="0"/>
+          <w:i w:val="0"/>
+          <w:color w:val="333333"/>
+          <w:sz w:val="18"/>
+          <w:u w:val="none"/>
+        </w:rPr>
+        <w:t xml:space="preserve">    Navigatieknoppen (Dosisoverzicht, DM VSM, enz.)  Sectie 1.3</w:t>
       </w:r>
     </w:p>
     <w:p>

</xml_diff>